<commit_message>
Update manuscript.docx with latest revisions from markdown source
</commit_message>
<xml_diff>
--- a/manuscript/manuscript.docx
+++ b/manuscript/manuscript.docx
@@ -7,49 +7,7 @@
         <w:pStyle w:val="Title"/>
       </w:pPr>
       <w:r>
-        <w:t xml:space="preserve">The</w:t>
-      </w:r>
-      <w:r>
-        <w:t xml:space="preserve"> </w:t>
-      </w:r>
-      <w:r>
-        <w:t xml:space="preserve">stability</w:t>
-      </w:r>
-      <w:r>
-        <w:t xml:space="preserve"> </w:t>
-      </w:r>
-      <w:r>
-        <w:t xml:space="preserve">illusion:</w:t>
-      </w:r>
-      <w:r>
-        <w:t xml:space="preserve"> </w:t>
-      </w:r>
-      <w:r>
-        <w:t xml:space="preserve">A</w:t>
-      </w:r>
-      <w:r>
-        <w:t xml:space="preserve"> </w:t>
-      </w:r>
-      <w:r>
-        <w:t xml:space="preserve">simulation-based</w:t>
-      </w:r>
-      <w:r>
-        <w:t xml:space="preserve"> </w:t>
-      </w:r>
-      <w:r>
-        <w:t xml:space="preserve">assessment</w:t>
-      </w:r>
-      <w:r>
-        <w:t xml:space="preserve"> </w:t>
-      </w:r>
-      <w:r>
-        <w:t xml:space="preserve">of</w:t>
-      </w:r>
-      <w:r>
-        <w:t xml:space="preserve"> </w:t>
-      </w:r>
-      <w:r>
-        <w:t xml:space="preserve">feature</w:t>
+        <w:t xml:space="preserve">Feature</w:t>
       </w:r>
       <w:r>
         <w:t xml:space="preserve"> </w:t>
@@ -67,7 +25,37 @@
         <w:t xml:space="preserve"> </w:t>
       </w:r>
       <w:r>
-        <w:t xml:space="preserve">for</w:t>
+        <w:t xml:space="preserve">fail</w:t>
+      </w:r>
+      <w:r>
+        <w:t xml:space="preserve"> </w:t>
+      </w:r>
+      <w:r>
+        <w:t xml:space="preserve">to</w:t>
+      </w:r>
+      <w:r>
+        <w:t xml:space="preserve"> </w:t>
+      </w:r>
+      <w:r>
+        <w:t xml:space="preserve">produce</w:t>
+      </w:r>
+      <w:r>
+        <w:t xml:space="preserve"> </w:t>
+      </w:r>
+      <w:r>
+        <w:t xml:space="preserve">stable</w:t>
+      </w:r>
+      <w:r>
+        <w:t xml:space="preserve"> </w:t>
+      </w:r>
+      <w:r>
+        <w:t xml:space="preserve">results</w:t>
+      </w:r>
+      <w:r>
+        <w:t xml:space="preserve"> </w:t>
+      </w:r>
+      <w:r>
+        <w:t xml:space="preserve">in</w:t>
       </w:r>
       <w:r>
         <w:t xml:space="preserve"> </w:t>

</xml_diff>